<commit_message>
Add the submission package, review copy and readiness guards
- rebuild the main, supplementary and cover-letter Word files from the revised sources
- add the double-spaced, line-numbered review copy and the six separate figure files
- add a CMA-ES environment guard and style, bibliography and readiness tests
- pin cma==4.5.0 for the baselines environment
</commit_message>
<xml_diff>
--- a/paper/eo_submission/EO_cover_letter.docx
+++ b/paper/eo_submission/EO_cover_letter.docx
@@ -73,7 +73,7 @@
           <w:i w:val="0"/>
           <w:sz w:val="24"/>
         </w:rPr>
-        <w:t>“A Decision-Consequence Auditing Framework for Reliable Surrogate-Assisted Optimization in Expensive Engineering Design”</w:t>
+        <w:t>“Decision-consequence auditing for surrogate-assisted optimization in expensive engineering design”</w:t>
       </w:r>
       <w:r>
         <w:rPr>
@@ -168,7 +168,7 @@
           <w:i w:val="0"/>
           <w:sz w:val="24"/>
         </w:rPr>
-        <w:t>The manuscript makes three contributions to reliable numerical optimization:</w:t>
+        <w:t>The manuscript's contributions are:</w:t>
       </w:r>
     </w:p>
     <w:p>
@@ -238,7 +238,7 @@
           <w:i w:val="0"/>
           <w:sz w:val="24"/>
         </w:rPr>
-        <w:t>Identical context-point decisions share deterministic responses, reducing 480 policy-state choices to 261 distinct actions and requiring 138 additional finite-element labels.</w:t>
+        <w:t>Identical context-point decisions share deterministic responses, so the same exact immediate-utility report costs 138 paid finite-element solves instead of 480, with a minimality argument for the declared oracle.</w:t>
       </w:r>
     </w:p>
     <w:p>
@@ -264,7 +264,7 @@
           <w:i w:val="0"/>
           <w:sz w:val="24"/>
         </w:rPr>
-        <w:t xml:space="preserve">Engineering validation: </w:t>
+        <w:t xml:space="preserve">Recorded verdicts and engineering validation: </w:t>
       </w:r>
       <w:r>
         <w:rPr>
@@ -273,7 +273,7 @@
           <w:i w:val="0"/>
           <w:sz w:val="24"/>
         </w:rPr>
-        <w:t>The framework is tested on 24 BBOB functions, a finite-element beam family, frozen Gaussian-process acquisition states, and twenty transfer cases at two load positions.</w:t>
+        <w:t>One declared promotion rule applied to three frozen acquisition rules returns one promotion, one stop and one held-for-revision verdict; the procedure is applied to 24 BBOB functions, a finite-element beam family, frozen acquisition states and twenty transfer cases at two load positions.</w:t>
       </w:r>
     </w:p>
     <w:p>
@@ -319,7 +319,7 @@
           <w:i w:val="0"/>
           <w:sz w:val="24"/>
         </w:rPr>
-        <w:t>The study concerns numerical optimization when function evaluations are expensive and surrogate model management determines which simulations are paid for. Its emphasis is the reliability of optimization decisions, not prediction accuracy in isolation.</w:t>
+        <w:t>The study concerns numerical optimization when function evaluations are expensive and surrogate model management determines which simulations are paid for. Its object is the reliability of the decision, not prediction accuracy in isolation, and it claims no optimizer superiority.</w:t>
       </w:r>
     </w:p>
     <w:p>
@@ -457,7 +457,7 @@
           <w:i w:val="0"/>
           <w:sz w:val="24"/>
         </w:rPr>
-        <w:t>Frozen protocols, deterministic seed maps, prediction-before-label journals, source hashes, integrity checks, and recovery-aware cost ledgers support the reported evidence. The manuscript sources and curated records are available in the project repository, with larger historical archives available from the corresponding author upon reasonable request.</w:t>
+        <w:t>Frozen protocols, deterministic seed maps, prediction-before-label journals, source hashes and recovery-aware cost ledgers support the reported evidence. The sources and curated records will be released in the project repository upon acceptance and are available to reviewers on request.</w:t>
       </w:r>
     </w:p>
     <w:p>
@@ -479,7 +479,7 @@
           <w:i w:val="0"/>
           <w:sz w:val="24"/>
         </w:rPr>
-        <w:t>The manuscript is original, is not under consideration elsewhere, and has been approved by all authors. No conflicts of interest or specific funding are reported. OpenAI Codex was used only for copyediting and language refinement; all affected text was reviewed by the authors.</w:t>
+        <w:t>The manuscript is original, is not under consideration elsewhere (an earlier version was submitted to Computers, Materials &amp; Continua and rejected there as out of scope), and has been approved by all authors. No conflicts of interest or specific funding are reported. DeepSeek V4.1 Flash (version 1017) was used only for copyediting and language refinement. The authors confirm the originality and accuracy of the content, have checked the tool's terms of use and confirm that this use is suitable for publication, and take full responsibility for the integrity of the whole content, including the accuracy of the references.</w:t>
       </w:r>
     </w:p>
     <w:p>

</xml_diff>